<commit_message>
Update paths w/ new Sharepoint dir
</commit_message>
<xml_diff>
--- a/Documentation SBTN State of Nature Layers for Water v2.docx
+++ b/Documentation SBTN State of Nature Layers for Water v2.docx
@@ -12492,11 +12492,11 @@
 </file>
 
 <file path=customXml/item1.xml><?xml version="1.0" encoding="utf-8"?>
-<ct:contentTypeSchema xmlns:ct="http://schemas.microsoft.com/office/2006/metadata/contentType" xmlns:ma="http://schemas.microsoft.com/office/2006/metadata/properties/metaAttributes" ct:_="" ma:_="" ma:contentTypeName="Document" ma:contentTypeID="0x010100514581BE4F890A428CF213F5B3273D40" ma:contentTypeVersion="18" ma:contentTypeDescription="Create a new document." ma:contentTypeScope="" ma:versionID="b21868dd4d3cd75284790b00a50f322e">
-  <xsd:schema xmlns:xsd="http://www.w3.org/2001/XMLSchema" xmlns:xs="http://www.w3.org/2001/XMLSchema" xmlns:p="http://schemas.microsoft.com/office/2006/metadata/properties" xmlns:ns1="http://schemas.microsoft.com/sharepoint/v3" xmlns:ns2="f3250919-af5f-48a2-b584-e9baed1e4802" xmlns:ns3="384ccce5-7f53-43d6-8193-853f21179d48" targetNamespace="http://schemas.microsoft.com/office/2006/metadata/properties" ma:root="true" ma:fieldsID="56d3b5d0707120f489a15512c15ae3f7" ns1:_="" ns2:_="" ns3:_="">
+<ct:contentTypeSchema xmlns:ct="http://schemas.microsoft.com/office/2006/metadata/contentType" xmlns:ma="http://schemas.microsoft.com/office/2006/metadata/properties/metaAttributes" ct:_="" ma:_="" ma:contentTypeName="Dokument" ma:contentTypeID="0x010100AD893BDA9A4A19469C22CE1A7AFDB3AF" ma:contentTypeVersion="21" ma:contentTypeDescription="Ein neues Dokument erstellen." ma:contentTypeScope="" ma:versionID="ab7a0d49f0bc96de9bf2d518105f83fa">
+  <xsd:schema xmlns:xsd="http://www.w3.org/2001/XMLSchema" xmlns:xs="http://www.w3.org/2001/XMLSchema" xmlns:p="http://schemas.microsoft.com/office/2006/metadata/properties" xmlns:ns1="http://schemas.microsoft.com/sharepoint/v3" xmlns:ns2="5ce545a2-3605-412b-9fcd-e18a95c5bb76" xmlns:ns3="7ca8a6a3-0f5d-4388-9d9a-24c876c0b7e8" targetNamespace="http://schemas.microsoft.com/office/2006/metadata/properties" ma:root="true" ma:fieldsID="90d49a44f9e9cdc0086b6accda915a47" ns1:_="" ns2:_="" ns3:_="">
     <xsd:import namespace="http://schemas.microsoft.com/sharepoint/v3"/>
-    <xsd:import namespace="f3250919-af5f-48a2-b584-e9baed1e4802"/>
-    <xsd:import namespace="384ccce5-7f53-43d6-8193-853f21179d48"/>
+    <xsd:import namespace="5ce545a2-3605-412b-9fcd-e18a95c5bb76"/>
+    <xsd:import namespace="7ca8a6a3-0f5d-4388-9d9a-24c876c0b7e8"/>
     <xsd:element name="properties">
       <xsd:complexType>
         <xsd:sequence>
@@ -12505,21 +12505,24 @@
               <xsd:all>
                 <xsd:element ref="ns2:MediaServiceMetadata" minOccurs="0"/>
                 <xsd:element ref="ns2:MediaServiceFastMetadata" minOccurs="0"/>
-                <xsd:element ref="ns2:MediaServiceAutoKeyPoints" minOccurs="0"/>
-                <xsd:element ref="ns2:MediaServiceKeyPoints" minOccurs="0"/>
                 <xsd:element ref="ns2:MediaServiceDateTaken" minOccurs="0"/>
                 <xsd:element ref="ns2:MediaServiceAutoTags" minOccurs="0"/>
                 <xsd:element ref="ns2:MediaServiceGenerationTime" minOccurs="0"/>
                 <xsd:element ref="ns2:MediaServiceEventHashCode" minOccurs="0"/>
                 <xsd:element ref="ns2:MediaServiceOCR" minOccurs="0"/>
+                <xsd:element ref="ns3:SharedWithUsers" minOccurs="0"/>
+                <xsd:element ref="ns3:SharedWithDetails" minOccurs="0"/>
+                <xsd:element ref="ns2:MediaServiceAutoKeyPoints" minOccurs="0"/>
+                <xsd:element ref="ns2:MediaServiceKeyPoints" minOccurs="0"/>
+                <xsd:element ref="ns2:MediaServiceLocation" minOccurs="0"/>
                 <xsd:element ref="ns2:MediaLengthInSeconds" minOccurs="0"/>
                 <xsd:element ref="ns1:_ip_UnifiedCompliancePolicyProperties" minOccurs="0"/>
                 <xsd:element ref="ns1:_ip_UnifiedCompliancePolicyUIAction" minOccurs="0"/>
-                <xsd:element ref="ns3:SharedWithUsers" minOccurs="0"/>
-                <xsd:element ref="ns3:SharedWithDetails" minOccurs="0"/>
                 <xsd:element ref="ns2:lcf76f155ced4ddcb4097134ff3c332f" minOccurs="0"/>
                 <xsd:element ref="ns3:TaxCatchAll" minOccurs="0"/>
-                <xsd:element ref="ns2:MediaServiceLocation" minOccurs="0"/>
+                <xsd:element ref="ns2:MediaServiceObjectDetectorVersions" minOccurs="0"/>
+                <xsd:element ref="ns2:MediaServiceSearchProperties" minOccurs="0"/>
+                <xsd:element ref="ns2:MediaServiceBillingMetadata" minOccurs="0"/>
               </xsd:all>
             </xsd:complexType>
           </xsd:element>
@@ -12530,18 +12533,18 @@
   <xsd:schema xmlns:xsd="http://www.w3.org/2001/XMLSchema" xmlns:xs="http://www.w3.org/2001/XMLSchema" xmlns:dms="http://schemas.microsoft.com/office/2006/documentManagement/types" xmlns:pc="http://schemas.microsoft.com/office/infopath/2007/PartnerControls" targetNamespace="http://schemas.microsoft.com/sharepoint/v3" elementFormDefault="qualified">
     <xsd:import namespace="http://schemas.microsoft.com/office/2006/documentManagement/types"/>
     <xsd:import namespace="http://schemas.microsoft.com/office/infopath/2007/PartnerControls"/>
-    <xsd:element name="_ip_UnifiedCompliancePolicyProperties" ma:index="18" nillable="true" ma:displayName="Unified Compliance Policy Properties" ma:hidden="true" ma:internalName="_ip_UnifiedCompliancePolicyProperties">
+    <xsd:element name="_ip_UnifiedCompliancePolicyProperties" ma:index="21" nillable="true" ma:displayName="Eigenschaften der einheitlichen Compliancerichtlinie" ma:hidden="true" ma:internalName="_ip_UnifiedCompliancePolicyProperties">
       <xsd:simpleType>
         <xsd:restriction base="dms:Note"/>
       </xsd:simpleType>
     </xsd:element>
-    <xsd:element name="_ip_UnifiedCompliancePolicyUIAction" ma:index="19" nillable="true" ma:displayName="Unified Compliance Policy UI Action" ma:hidden="true" ma:internalName="_ip_UnifiedCompliancePolicyUIAction">
+    <xsd:element name="_ip_UnifiedCompliancePolicyUIAction" ma:index="22" nillable="true" ma:displayName="UI-Aktion der einheitlichen Compliancerichtlinie" ma:hidden="true" ma:internalName="_ip_UnifiedCompliancePolicyUIAction">
       <xsd:simpleType>
         <xsd:restriction base="dms:Text"/>
       </xsd:simpleType>
     </xsd:element>
   </xsd:schema>
-  <xsd:schema xmlns:xsd="http://www.w3.org/2001/XMLSchema" xmlns:xs="http://www.w3.org/2001/XMLSchema" xmlns:dms="http://schemas.microsoft.com/office/2006/documentManagement/types" xmlns:pc="http://schemas.microsoft.com/office/infopath/2007/PartnerControls" targetNamespace="f3250919-af5f-48a2-b584-e9baed1e4802" elementFormDefault="qualified">
+  <xsd:schema xmlns:xsd="http://www.w3.org/2001/XMLSchema" xmlns:xs="http://www.w3.org/2001/XMLSchema" xmlns:dms="http://schemas.microsoft.com/office/2006/documentManagement/types" xmlns:pc="http://schemas.microsoft.com/office/infopath/2007/PartnerControls" targetNamespace="5ce545a2-3605-412b-9fcd-e18a95c5bb76" elementFormDefault="qualified">
     <xsd:import namespace="http://schemas.microsoft.com/office/2006/documentManagement/types"/>
     <xsd:import namespace="http://schemas.microsoft.com/office/infopath/2007/PartnerControls"/>
     <xsd:element name="MediaServiceMetadata" ma:index="8" nillable="true" ma:displayName="MediaServiceMetadata" ma:hidden="true" ma:internalName="MediaServiceMetadata" ma:readOnly="true">
@@ -12554,67 +12557,82 @@
         <xsd:restriction base="dms:Note"/>
       </xsd:simpleType>
     </xsd:element>
-    <xsd:element name="MediaServiceAutoKeyPoints" ma:index="10" nillable="true" ma:displayName="MediaServiceAutoKeyPoints" ma:hidden="true" ma:internalName="MediaServiceAutoKeyPoints" ma:readOnly="true">
+    <xsd:element name="MediaServiceDateTaken" ma:index="10" nillable="true" ma:displayName="MediaServiceDateTaken" ma:hidden="true" ma:internalName="MediaServiceDateTaken" ma:readOnly="true">
       <xsd:simpleType>
-        <xsd:restriction base="dms:Note"/>
+        <xsd:restriction base="dms:Text"/>
       </xsd:simpleType>
     </xsd:element>
-    <xsd:element name="MediaServiceKeyPoints" ma:index="11" nillable="true" ma:displayName="KeyPoints" ma:internalName="MediaServiceKeyPoints" ma:readOnly="true">
+    <xsd:element name="MediaServiceAutoTags" ma:index="11" nillable="true" ma:displayName="Tags" ma:internalName="MediaServiceAutoTags" ma:readOnly="true">
+      <xsd:simpleType>
+        <xsd:restriction base="dms:Text"/>
+      </xsd:simpleType>
+    </xsd:element>
+    <xsd:element name="MediaServiceGenerationTime" ma:index="12" nillable="true" ma:displayName="MediaServiceGenerationTime" ma:hidden="true" ma:internalName="MediaServiceGenerationTime" ma:readOnly="true">
+      <xsd:simpleType>
+        <xsd:restriction base="dms:Text"/>
+      </xsd:simpleType>
+    </xsd:element>
+    <xsd:element name="MediaServiceEventHashCode" ma:index="13" nillable="true" ma:displayName="MediaServiceEventHashCode" ma:hidden="true" ma:internalName="MediaServiceEventHashCode" ma:readOnly="true">
+      <xsd:simpleType>
+        <xsd:restriction base="dms:Text"/>
+      </xsd:simpleType>
+    </xsd:element>
+    <xsd:element name="MediaServiceOCR" ma:index="14" nillable="true" ma:displayName="Extracted Text" ma:internalName="MediaServiceOCR" ma:readOnly="true">
       <xsd:simpleType>
         <xsd:restriction base="dms:Note">
           <xsd:maxLength value="255"/>
         </xsd:restriction>
       </xsd:simpleType>
     </xsd:element>
-    <xsd:element name="MediaServiceDateTaken" ma:index="12" nillable="true" ma:displayName="MediaServiceDateTaken" ma:hidden="true" ma:internalName="MediaServiceDateTaken" ma:readOnly="true">
+    <xsd:element name="MediaServiceAutoKeyPoints" ma:index="17" nillable="true" ma:displayName="MediaServiceAutoKeyPoints" ma:hidden="true" ma:internalName="MediaServiceAutoKeyPoints" ma:readOnly="true">
       <xsd:simpleType>
-        <xsd:restriction base="dms:Text"/>
+        <xsd:restriction base="dms:Note"/>
       </xsd:simpleType>
     </xsd:element>
-    <xsd:element name="MediaServiceAutoTags" ma:index="13" nillable="true" ma:displayName="Tags" ma:internalName="MediaServiceAutoTags" ma:readOnly="true">
-      <xsd:simpleType>
-        <xsd:restriction base="dms:Text"/>
-      </xsd:simpleType>
-    </xsd:element>
-    <xsd:element name="MediaServiceGenerationTime" ma:index="14" nillable="true" ma:displayName="MediaServiceGenerationTime" ma:hidden="true" ma:internalName="MediaServiceGenerationTime" ma:readOnly="true">
-      <xsd:simpleType>
-        <xsd:restriction base="dms:Text"/>
-      </xsd:simpleType>
-    </xsd:element>
-    <xsd:element name="MediaServiceEventHashCode" ma:index="15" nillable="true" ma:displayName="MediaServiceEventHashCode" ma:hidden="true" ma:internalName="MediaServiceEventHashCode" ma:readOnly="true">
-      <xsd:simpleType>
-        <xsd:restriction base="dms:Text"/>
-      </xsd:simpleType>
-    </xsd:element>
-    <xsd:element name="MediaServiceOCR" ma:index="16" nillable="true" ma:displayName="Extracted Text" ma:internalName="MediaServiceOCR" ma:readOnly="true">
+    <xsd:element name="MediaServiceKeyPoints" ma:index="18" nillable="true" ma:displayName="KeyPoints" ma:internalName="MediaServiceKeyPoints" ma:readOnly="true">
       <xsd:simpleType>
         <xsd:restriction base="dms:Note">
           <xsd:maxLength value="255"/>
         </xsd:restriction>
       </xsd:simpleType>
     </xsd:element>
-    <xsd:element name="MediaLengthInSeconds" ma:index="17" nillable="true" ma:displayName="Length (seconds)" ma:internalName="MediaLengthInSeconds" ma:readOnly="true">
+    <xsd:element name="MediaServiceLocation" ma:index="19" nillable="true" ma:displayName="Location" ma:internalName="MediaServiceLocation" ma:readOnly="true">
+      <xsd:simpleType>
+        <xsd:restriction base="dms:Text"/>
+      </xsd:simpleType>
+    </xsd:element>
+    <xsd:element name="MediaLengthInSeconds" ma:index="20" nillable="true" ma:displayName="Length (seconds)" ma:internalName="MediaLengthInSeconds" ma:readOnly="true">
       <xsd:simpleType>
         <xsd:restriction base="dms:Unknown"/>
       </xsd:simpleType>
     </xsd:element>
-    <xsd:element name="lcf76f155ced4ddcb4097134ff3c332f" ma:index="23" nillable="true" ma:taxonomy="true" ma:internalName="lcf76f155ced4ddcb4097134ff3c332f" ma:taxonomyFieldName="MediaServiceImageTags" ma:displayName="Image Tags" ma:readOnly="false" ma:fieldId="{5cf76f15-5ced-4ddc-b409-7134ff3c332f}" ma:taxonomyMulti="true" ma:sspId="3d60032c-6068-4305-b459-002d828e96a0" ma:termSetId="09814cd3-568e-fe90-9814-8d621ff8fb84" ma:anchorId="fba54fb3-c3e1-fe81-a776-ca4b69148c4d" ma:open="true" ma:isKeyword="false">
+    <xsd:element name="lcf76f155ced4ddcb4097134ff3c332f" ma:index="24" nillable="true" ma:taxonomy="true" ma:internalName="lcf76f155ced4ddcb4097134ff3c332f" ma:taxonomyFieldName="MediaServiceImageTags" ma:displayName="Bildmarkierungen" ma:readOnly="false" ma:fieldId="{5cf76f15-5ced-4ddc-b409-7134ff3c332f}" ma:taxonomyMulti="true" ma:sspId="3d60032c-6068-4305-b459-002d828e96a0" ma:termSetId="09814cd3-568e-fe90-9814-8d621ff8fb84" ma:anchorId="fba54fb3-c3e1-fe81-a776-ca4b69148c4d" ma:open="true" ma:isKeyword="false">
       <xsd:complexType>
         <xsd:sequence>
           <xsd:element ref="pc:Terms" minOccurs="0" maxOccurs="1"/>
         </xsd:sequence>
       </xsd:complexType>
     </xsd:element>
-    <xsd:element name="MediaServiceLocation" ma:index="25" nillable="true" ma:displayName="Location" ma:internalName="MediaServiceLocation" ma:readOnly="true">
+    <xsd:element name="MediaServiceObjectDetectorVersions" ma:index="26" nillable="true" ma:displayName="MediaServiceObjectDetectorVersions" ma:description="" ma:hidden="true" ma:indexed="true" ma:internalName="MediaServiceObjectDetectorVersions" ma:readOnly="true">
       <xsd:simpleType>
         <xsd:restriction base="dms:Text"/>
       </xsd:simpleType>
     </xsd:element>
+    <xsd:element name="MediaServiceSearchProperties" ma:index="27" nillable="true" ma:displayName="MediaServiceSearchProperties" ma:hidden="true" ma:internalName="MediaServiceSearchProperties" ma:readOnly="true">
+      <xsd:simpleType>
+        <xsd:restriction base="dms:Note"/>
+      </xsd:simpleType>
+    </xsd:element>
+    <xsd:element name="MediaServiceBillingMetadata" ma:index="28" nillable="true" ma:displayName="MediaServiceBillingMetadata" ma:hidden="true" ma:internalName="MediaServiceBillingMetadata" ma:readOnly="true">
+      <xsd:simpleType>
+        <xsd:restriction base="dms:Note"/>
+      </xsd:simpleType>
+    </xsd:element>
   </xsd:schema>
-  <xsd:schema xmlns:xsd="http://www.w3.org/2001/XMLSchema" xmlns:xs="http://www.w3.org/2001/XMLSchema" xmlns:dms="http://schemas.microsoft.com/office/2006/documentManagement/types" xmlns:pc="http://schemas.microsoft.com/office/infopath/2007/PartnerControls" targetNamespace="384ccce5-7f53-43d6-8193-853f21179d48" elementFormDefault="qualified">
+  <xsd:schema xmlns:xsd="http://www.w3.org/2001/XMLSchema" xmlns:xs="http://www.w3.org/2001/XMLSchema" xmlns:dms="http://schemas.microsoft.com/office/2006/documentManagement/types" xmlns:pc="http://schemas.microsoft.com/office/infopath/2007/PartnerControls" targetNamespace="7ca8a6a3-0f5d-4388-9d9a-24c876c0b7e8" elementFormDefault="qualified">
     <xsd:import namespace="http://schemas.microsoft.com/office/2006/documentManagement/types"/>
     <xsd:import namespace="http://schemas.microsoft.com/office/infopath/2007/PartnerControls"/>
-    <xsd:element name="SharedWithUsers" ma:index="20" nillable="true" ma:displayName="Shared With" ma:internalName="SharedWithUsers" ma:readOnly="true">
+    <xsd:element name="SharedWithUsers" ma:index="15" nillable="true" ma:displayName="Freigegeben für" ma:internalName="SharedWithUsers" ma:readOnly="true">
       <xsd:complexType>
         <xsd:complexContent>
           <xsd:extension base="dms:UserMulti">
@@ -12633,14 +12651,14 @@
         </xsd:complexContent>
       </xsd:complexType>
     </xsd:element>
-    <xsd:element name="SharedWithDetails" ma:index="21" nillable="true" ma:displayName="Shared With Details" ma:internalName="SharedWithDetails" ma:readOnly="true">
+    <xsd:element name="SharedWithDetails" ma:index="16" nillable="true" ma:displayName="Freigegeben für - Details" ma:internalName="SharedWithDetails" ma:readOnly="true">
       <xsd:simpleType>
         <xsd:restriction base="dms:Note">
           <xsd:maxLength value="255"/>
         </xsd:restriction>
       </xsd:simpleType>
     </xsd:element>
-    <xsd:element name="TaxCatchAll" ma:index="24" nillable="true" ma:displayName="Taxonomy Catch All Column" ma:hidden="true" ma:list="{a81817e5-1927-4d65-8651-6cc0fa9dc574}" ma:internalName="TaxCatchAll" ma:showField="CatchAllData" ma:web="384ccce5-7f53-43d6-8193-853f21179d48">
+    <xsd:element name="TaxCatchAll" ma:index="25" nillable="true" ma:displayName="Taxonomy Catch All Column" ma:hidden="true" ma:list="{51bef38f-916d-43ec-b606-3ff645e2e8ef}" ma:internalName="TaxCatchAll" ma:showField="CatchAllData" ma:web="7ca8a6a3-0f5d-4388-9d9a-24c876c0b7e8">
       <xsd:complexType>
         <xsd:complexContent>
           <xsd:extension base="dms:MultiChoiceLookup">
@@ -12661,8 +12679,8 @@
         <xsd:element ref="dc:creator" minOccurs="0" maxOccurs="1"/>
         <xsd:element ref="dcterms:created" minOccurs="0" maxOccurs="1"/>
         <xsd:element ref="dc:identifier" minOccurs="0" maxOccurs="1"/>
-        <xsd:element name="contentType" minOccurs="0" maxOccurs="1" type="xsd:string" ma:index="0" ma:displayName="Content Type"/>
-        <xsd:element ref="dc:title" minOccurs="0" maxOccurs="1" ma:index="4" ma:displayName="Title"/>
+        <xsd:element name="contentType" minOccurs="0" maxOccurs="1" type="xsd:string" ma:index="0" ma:displayName="Inhaltstyp"/>
+        <xsd:element ref="dc:title" minOccurs="0" maxOccurs="1" ma:index="4" ma:displayName="Titel"/>
         <xsd:element ref="dc:subject" minOccurs="0" maxOccurs="1"/>
         <xsd:element ref="dc:description" minOccurs="0" maxOccurs="1"/>
         <xsd:element name="keywords" minOccurs="0" maxOccurs="1" type="xsd:string"/>
@@ -12770,24 +12788,21 @@
 <b:Sources xmlns:b="http://schemas.openxmlformats.org/officeDocument/2006/bibliography" xmlns="http://schemas.openxmlformats.org/officeDocument/2006/bibliography" SelectedStyle="/APASixthEditionOfficeOnline.xsl" StyleName="APA" Version="6"/>
 </file>
 
+<file path=customXml/item5.xml><?xml version="1.0" encoding="utf-8"?>
+<p:properties xmlns:p="http://schemas.microsoft.com/office/2006/metadata/properties" xmlns:xsi="http://www.w3.org/2001/XMLSchema-instance" xmlns:pc="http://schemas.microsoft.com/office/infopath/2007/PartnerControls">
+  <documentManagement>
+    <_ip_UnifiedCompliancePolicyUIAction xmlns="http://schemas.microsoft.com/sharepoint/v3" xsi:nil="true"/>
+    <TaxCatchAll xmlns="7ca8a6a3-0f5d-4388-9d9a-24c876c0b7e8" xsi:nil="true"/>
+    <lcf76f155ced4ddcb4097134ff3c332f xmlns="5ce545a2-3605-412b-9fcd-e18a95c5bb76">
+      <Terms xmlns="http://schemas.microsoft.com/office/infopath/2007/PartnerControls"/>
+    </lcf76f155ced4ddcb4097134ff3c332f>
+    <_ip_UnifiedCompliancePolicyProperties xmlns="http://schemas.microsoft.com/sharepoint/v3" xsi:nil="true"/>
+  </documentManagement>
+</p:properties>
+</file>
+
 <file path=customXml/itemProps1.xml><?xml version="1.0" encoding="utf-8"?>
-<ds:datastoreItem xmlns:ds="http://schemas.openxmlformats.org/officeDocument/2006/customXml" ds:itemID="{FDE20F9F-923D-4817-A96B-820CBFA6B6F4}">
-  <ds:schemaRefs>
-    <ds:schemaRef ds:uri="http://schemas.microsoft.com/office/2006/metadata/contentType"/>
-    <ds:schemaRef ds:uri="http://schemas.microsoft.com/office/2006/metadata/properties/metaAttributes"/>
-    <ds:schemaRef ds:uri="http://www.w3.org/2001/XMLSchema"/>
-    <ds:schemaRef ds:uri="http://schemas.microsoft.com/office/2006/metadata/properties"/>
-    <ds:schemaRef ds:uri="http://schemas.microsoft.com/sharepoint/v3"/>
-    <ds:schemaRef ds:uri="f3250919-af5f-48a2-b584-e9baed1e4802"/>
-    <ds:schemaRef ds:uri="384ccce5-7f53-43d6-8193-853f21179d48"/>
-    <ds:schemaRef ds:uri="http://schemas.microsoft.com/office/2006/documentManagement/types"/>
-    <ds:schemaRef ds:uri="http://schemas.microsoft.com/office/infopath/2007/PartnerControls"/>
-    <ds:schemaRef ds:uri="http://schemas.openxmlformats.org/package/2006/metadata/core-properties"/>
-    <ds:schemaRef ds:uri="http://purl.org/dc/elements/1.1/"/>
-    <ds:schemaRef ds:uri="http://purl.org/dc/terms/"/>
-    <ds:schemaRef ds:uri="http://schemas.microsoft.com/internal/obd"/>
-  </ds:schemaRefs>
-</ds:datastoreItem>
+<ds:datastoreItem xmlns:ds="http://schemas.openxmlformats.org/officeDocument/2006/customXml" ds:itemID="{CAD03139-CAB6-4E75-BEA3-908AE1DAF40D}"/>
 </file>
 
 <file path=customXml/itemProps2.xml><?xml version="1.0" encoding="utf-8"?>
@@ -12813,4 +12828,8 @@
     <ds:schemaRef ds:uri="http://schemas.openxmlformats.org/officeDocument/2006/bibliography"/>
   </ds:schemaRefs>
 </ds:datastoreItem>
+</file>
+
+<file path=customXml/itemProps5.xml><?xml version="1.0" encoding="utf-8"?>
+<ds:datastoreItem xmlns:ds="http://schemas.openxmlformats.org/officeDocument/2006/customXml" ds:itemID="{B133486A-4C46-4D74-B9F1-4FE7CD42D1FD}"/>
 </file>
</xml_diff>